<commit_message>
Release 1.0.20 — lead wipe COC sampleType and containmentName
- Pass sampleType and containmentName into Lead Wipe template generation

- Map wipe sample types to Pre-Start or Clearance for COC documents

- Update Lead Wipe Template placeholders
</commit_message>
<xml_diff>
--- a/templates/Lead Wipe Template.docx
+++ b/templates/Lead Wipe Template.docx
@@ -155,7 +155,25 @@
                 <w:sz w:val="20"/>
                 <w:szCs w:val="20"/>
               </w:rPr>
-              <w:t>{sampleID}</w:t>
+              <w:t>{</w:t>
+            </w:r>
+            <w:proofErr w:type="spellStart"/>
+            <w:r>
+              <w:rPr>
+                <w:rFonts w:ascii="Arial" w:hAnsi="Arial" w:cs="Arial"/>
+                <w:sz w:val="20"/>
+                <w:szCs w:val="20"/>
+              </w:rPr>
+              <w:t>sampleID</w:t>
+            </w:r>
+            <w:proofErr w:type="spellEnd"/>
+            <w:r>
+              <w:rPr>
+                <w:rFonts w:ascii="Arial" w:hAnsi="Arial" w:cs="Arial"/>
+                <w:sz w:val="20"/>
+                <w:szCs w:val="20"/>
+              </w:rPr>
+              <w:t>}</w:t>
             </w:r>
           </w:p>
         </w:tc>
@@ -233,15 +251,41 @@
                 <w:sz w:val="20"/>
                 <w:szCs w:val="20"/>
               </w:rPr>
-              <w:t>Clearance Lead Wipe</w:t>
-            </w:r>
-            <w:r>
-              <w:rPr>
-                <w:rFonts w:ascii="Arial" w:hAnsi="Arial" w:cs="Arial"/>
-                <w:sz w:val="20"/>
-                <w:szCs w:val="20"/>
-              </w:rPr>
-              <w:t xml:space="preserve"> Sample on </w:t>
+              <w:t>{</w:t>
+            </w:r>
+            <w:proofErr w:type="spellStart"/>
+            <w:r>
+              <w:rPr>
+                <w:rFonts w:ascii="Arial" w:hAnsi="Arial" w:cs="Arial"/>
+                <w:sz w:val="20"/>
+                <w:szCs w:val="20"/>
+              </w:rPr>
+              <w:t>sampleType</w:t>
+            </w:r>
+            <w:proofErr w:type="spellEnd"/>
+            <w:r>
+              <w:rPr>
+                <w:rFonts w:ascii="Arial" w:hAnsi="Arial" w:cs="Arial"/>
+                <w:sz w:val="20"/>
+                <w:szCs w:val="20"/>
+              </w:rPr>
+              <w:t>}</w:t>
+            </w:r>
+            <w:r>
+              <w:rPr>
+                <w:rFonts w:ascii="Arial" w:hAnsi="Arial" w:cs="Arial"/>
+                <w:sz w:val="20"/>
+                <w:szCs w:val="20"/>
+              </w:rPr>
+              <w:t xml:space="preserve"> Lead Wipe</w:t>
+            </w:r>
+            <w:r>
+              <w:rPr>
+                <w:rFonts w:ascii="Arial" w:hAnsi="Arial" w:cs="Arial"/>
+                <w:sz w:val="20"/>
+                <w:szCs w:val="20"/>
+              </w:rPr>
+              <w:t xml:space="preserve"> on </w:t>
             </w:r>
             <w:r>
               <w:rPr>
@@ -334,7 +378,33 @@
                 <w:sz w:val="20"/>
                 <w:szCs w:val="20"/>
               </w:rPr>
-              <w:t>{buildingName}</w:t>
+              <w:t>{</w:t>
+            </w:r>
+            <w:proofErr w:type="spellStart"/>
+            <w:r>
+              <w:rPr>
+                <w:rFonts w:ascii="Arial" w:hAnsi="Arial" w:cs="Arial"/>
+                <w:sz w:val="20"/>
+                <w:szCs w:val="20"/>
+              </w:rPr>
+              <w:t>containmentName</w:t>
+            </w:r>
+            <w:proofErr w:type="spellEnd"/>
+            <w:r>
+              <w:rPr>
+                <w:rFonts w:ascii="Arial" w:hAnsi="Arial" w:cs="Arial"/>
+                <w:sz w:val="20"/>
+                <w:szCs w:val="20"/>
+              </w:rPr>
+              <w:t xml:space="preserve">} </w:t>
+            </w:r>
+            <w:r>
+              <w:rPr>
+                <w:rFonts w:ascii="Arial" w:hAnsi="Arial" w:cs="Arial"/>
+                <w:sz w:val="20"/>
+                <w:szCs w:val="20"/>
+              </w:rPr>
+              <w:t>|</w:t>
             </w:r>
             <w:r>
               <w:rPr>
@@ -350,7 +420,67 @@
                 <w:sz w:val="20"/>
                 <w:szCs w:val="20"/>
               </w:rPr>
-              <w:t xml:space="preserve"> {spaceName}</w:t>
+              <w:t>{</w:t>
+            </w:r>
+            <w:proofErr w:type="spellStart"/>
+            <w:r>
+              <w:rPr>
+                <w:rFonts w:ascii="Arial" w:hAnsi="Arial" w:cs="Arial"/>
+                <w:sz w:val="20"/>
+                <w:szCs w:val="20"/>
+              </w:rPr>
+              <w:t>buildingName</w:t>
+            </w:r>
+            <w:proofErr w:type="spellEnd"/>
+            <w:r>
+              <w:rPr>
+                <w:rFonts w:ascii="Arial" w:hAnsi="Arial" w:cs="Arial"/>
+                <w:sz w:val="20"/>
+                <w:szCs w:val="20"/>
+              </w:rPr>
+              <w:t>}</w:t>
+            </w:r>
+            <w:r>
+              <w:rPr>
+                <w:rFonts w:ascii="Arial" w:hAnsi="Arial" w:cs="Arial"/>
+                <w:sz w:val="20"/>
+                <w:szCs w:val="20"/>
+              </w:rPr>
+              <w:t xml:space="preserve"> </w:t>
+            </w:r>
+            <w:r>
+              <w:rPr>
+                <w:rFonts w:ascii="Arial" w:hAnsi="Arial" w:cs="Arial"/>
+                <w:sz w:val="20"/>
+                <w:szCs w:val="20"/>
+              </w:rPr>
+              <w:t>|</w:t>
+            </w:r>
+            <w:r>
+              <w:rPr>
+                <w:rFonts w:ascii="Arial" w:hAnsi="Arial" w:cs="Arial"/>
+                <w:sz w:val="20"/>
+                <w:szCs w:val="20"/>
+              </w:rPr>
+              <w:t xml:space="preserve"> {</w:t>
+            </w:r>
+            <w:proofErr w:type="spellStart"/>
+            <w:r>
+              <w:rPr>
+                <w:rFonts w:ascii="Arial" w:hAnsi="Arial" w:cs="Arial"/>
+                <w:sz w:val="20"/>
+                <w:szCs w:val="20"/>
+              </w:rPr>
+              <w:t>spaceName</w:t>
+            </w:r>
+            <w:proofErr w:type="spellEnd"/>
+            <w:r>
+              <w:rPr>
+                <w:rFonts w:ascii="Arial" w:hAnsi="Arial" w:cs="Arial"/>
+                <w:sz w:val="20"/>
+                <w:szCs w:val="20"/>
+              </w:rPr>
+              <w:t>}</w:t>
             </w:r>
             <w:r>
               <w:rPr>
@@ -366,13 +496,45 @@
                 <w:sz w:val="20"/>
                 <w:szCs w:val="20"/>
               </w:rPr>
-              <w:t>{locationComment}</w:t>
-            </w:r>
-            <w:r>
-              <w:rPr>
-                <w:rFonts w:ascii="Arial" w:hAnsi="Arial" w:cs="Arial"/>
-              </w:rPr>
-              <w:t>{/samplesWipe}</w:t>
+              <w:t>{</w:t>
+            </w:r>
+            <w:proofErr w:type="spellStart"/>
+            <w:r>
+              <w:rPr>
+                <w:rFonts w:ascii="Arial" w:hAnsi="Arial" w:cs="Arial"/>
+                <w:sz w:val="20"/>
+                <w:szCs w:val="20"/>
+              </w:rPr>
+              <w:t>locationComment</w:t>
+            </w:r>
+            <w:proofErr w:type="spellEnd"/>
+            <w:r>
+              <w:rPr>
+                <w:rFonts w:ascii="Arial" w:hAnsi="Arial" w:cs="Arial"/>
+                <w:sz w:val="20"/>
+                <w:szCs w:val="20"/>
+              </w:rPr>
+              <w:t>}</w:t>
+            </w:r>
+            <w:r>
+              <w:rPr>
+                <w:rFonts w:ascii="Arial" w:hAnsi="Arial" w:cs="Arial"/>
+              </w:rPr>
+              <w:t>{/</w:t>
+            </w:r>
+            <w:proofErr w:type="spellStart"/>
+            <w:r>
+              <w:rPr>
+                <w:rFonts w:ascii="Arial" w:hAnsi="Arial" w:cs="Arial"/>
+              </w:rPr>
+              <w:t>samplesWipe</w:t>
+            </w:r>
+            <w:proofErr w:type="spellEnd"/>
+            <w:r>
+              <w:rPr>
+                <w:rFonts w:ascii="Arial" w:hAnsi="Arial" w:cs="Arial"/>
+              </w:rPr>
+              <w:t>}</w:t>
             </w:r>
           </w:p>
         </w:tc>
@@ -506,7 +668,21 @@
             <w:rPr>
               <w:rFonts w:ascii="Arial" w:hAnsi="Arial" w:cs="Arial"/>
             </w:rPr>
-            <w:t>{inspectorName}</w:t>
+            <w:t>{</w:t>
+          </w:r>
+          <w:proofErr w:type="spellStart"/>
+          <w:r>
+            <w:rPr>
+              <w:rFonts w:ascii="Arial" w:hAnsi="Arial" w:cs="Arial"/>
+            </w:rPr>
+            <w:t>inspectorName</w:t>
+          </w:r>
+          <w:proofErr w:type="spellEnd"/>
+          <w:r>
+            <w:rPr>
+              <w:rFonts w:ascii="Arial" w:hAnsi="Arial" w:cs="Arial"/>
+            </w:rPr>
+            <w:t>}</w:t>
           </w:r>
         </w:p>
       </w:tc>
@@ -1016,12 +1192,14 @@
             </w:rPr>
             <w:t>{</w:t>
           </w:r>
+          <w:proofErr w:type="spellStart"/>
           <w:r>
             <w:rPr>
               <w:rFonts w:ascii="Arial" w:hAnsi="Arial" w:cs="Arial"/>
             </w:rPr>
             <w:t>inspectorName</w:t>
           </w:r>
+          <w:proofErr w:type="spellEnd"/>
           <w:r>
             <w:rPr>
               <w:rFonts w:ascii="Arial" w:hAnsi="Arial" w:cs="Arial"/>
@@ -1078,12 +1256,14 @@
             </w:rPr>
             <w:t>{</w:t>
           </w:r>
+          <w:proofErr w:type="spellStart"/>
           <w:r>
             <w:rPr>
               <w:rFonts w:ascii="Arial" w:hAnsi="Arial" w:cs="Arial"/>
             </w:rPr>
             <w:t>inspectorName</w:t>
           </w:r>
+          <w:proofErr w:type="spellEnd"/>
           <w:r>
             <w:rPr>
               <w:rFonts w:ascii="Arial" w:hAnsi="Arial" w:cs="Arial"/>
@@ -1195,7 +1375,21 @@
             <w:rPr>
               <w:rFonts w:ascii="Arial" w:hAnsi="Arial" w:cs="Arial"/>
             </w:rPr>
-            <w:t>{dateCollected}</w:t>
+            <w:t>{</w:t>
+          </w:r>
+          <w:proofErr w:type="spellStart"/>
+          <w:r>
+            <w:rPr>
+              <w:rFonts w:ascii="Arial" w:hAnsi="Arial" w:cs="Arial"/>
+            </w:rPr>
+            <w:t>dateCollected</w:t>
+          </w:r>
+          <w:proofErr w:type="spellEnd"/>
+          <w:r>
+            <w:rPr>
+              <w:rFonts w:ascii="Arial" w:hAnsi="Arial" w:cs="Arial"/>
+            </w:rPr>
+            <w:t>}</w:t>
           </w:r>
         </w:p>
       </w:tc>
@@ -1247,7 +1441,21 @@
             <w:rPr>
               <w:rFonts w:ascii="Arial" w:hAnsi="Arial" w:cs="Arial"/>
             </w:rPr>
-            <w:t>{analysisType}</w:t>
+            <w:t>{</w:t>
+          </w:r>
+          <w:proofErr w:type="spellStart"/>
+          <w:r>
+            <w:rPr>
+              <w:rFonts w:ascii="Arial" w:hAnsi="Arial" w:cs="Arial"/>
+            </w:rPr>
+            <w:t>analysisType</w:t>
+          </w:r>
+          <w:proofErr w:type="spellEnd"/>
+          <w:r>
+            <w:rPr>
+              <w:rFonts w:ascii="Arial" w:hAnsi="Arial" w:cs="Arial"/>
+            </w:rPr>
+            <w:t>}</w:t>
           </w:r>
         </w:p>
       </w:tc>
@@ -1360,7 +1568,21 @@
             <w:rPr>
               <w:rFonts w:ascii="Arial" w:hAnsi="Arial" w:cs="Arial"/>
             </w:rPr>
-            <w:t>{turnAroundTime}</w:t>
+            <w:t>{</w:t>
+          </w:r>
+          <w:proofErr w:type="spellStart"/>
+          <w:r>
+            <w:rPr>
+              <w:rFonts w:ascii="Arial" w:hAnsi="Arial" w:cs="Arial"/>
+            </w:rPr>
+            <w:t>turnAroundTime</w:t>
+          </w:r>
+          <w:proofErr w:type="spellEnd"/>
+          <w:r>
+            <w:rPr>
+              <w:rFonts w:ascii="Arial" w:hAnsi="Arial" w:cs="Arial"/>
+            </w:rPr>
+            <w:t>}</w:t>
           </w:r>
         </w:p>
       </w:tc>
@@ -1477,12 +1699,14 @@
             </w:rPr>
             <w:t>{</w:t>
           </w:r>
+          <w:proofErr w:type="spellStart"/>
           <w:r>
             <w:rPr>
               <w:rFonts w:ascii="Arial" w:hAnsi="Arial" w:cs="Arial"/>
             </w:rPr>
             <w:t>projectNumber</w:t>
           </w:r>
+          <w:proofErr w:type="spellEnd"/>
           <w:r>
             <w:rPr>
               <w:rFonts w:ascii="Arial" w:hAnsi="Arial" w:cs="Arial"/>
@@ -1538,7 +1762,14 @@
             <w:rPr>
               <w:rFonts w:ascii="Arial" w:hAnsi="Arial" w:cs="Arial"/>
             </w:rPr>
-            <w:t>{client</w:t>
+            <w:t>{</w:t>
+          </w:r>
+          <w:proofErr w:type="spellStart"/>
+          <w:r>
+            <w:rPr>
+              <w:rFonts w:ascii="Arial" w:hAnsi="Arial" w:cs="Arial"/>
+            </w:rPr>
+            <w:t>client</w:t>
           </w:r>
           <w:r>
             <w:rPr>
@@ -1546,6 +1777,7 @@
             </w:rPr>
             <w:t>Name</w:t>
           </w:r>
+          <w:proofErr w:type="spellEnd"/>
           <w:r>
             <w:rPr>
               <w:rFonts w:ascii="Arial" w:hAnsi="Arial" w:cs="Arial"/>
@@ -1576,7 +1808,21 @@
             <w:rPr>
               <w:rFonts w:ascii="Arial" w:hAnsi="Arial" w:cs="Arial"/>
             </w:rPr>
-            <w:t>{siteName}</w:t>
+            <w:t>{</w:t>
+          </w:r>
+          <w:proofErr w:type="spellStart"/>
+          <w:r>
+            <w:rPr>
+              <w:rFonts w:ascii="Arial" w:hAnsi="Arial" w:cs="Arial"/>
+            </w:rPr>
+            <w:t>siteName</w:t>
+          </w:r>
+          <w:proofErr w:type="spellEnd"/>
+          <w:r>
+            <w:rPr>
+              <w:rFonts w:ascii="Arial" w:hAnsi="Arial" w:cs="Arial"/>
+            </w:rPr>
+            <w:t>}</w:t>
           </w:r>
         </w:p>
       </w:tc>
@@ -1625,7 +1871,21 @@
             <w:rPr>
               <w:rFonts w:ascii="Arial" w:hAnsi="Arial" w:cs="Arial"/>
             </w:rPr>
-            <w:t>{spectialInstructions}</w:t>
+            <w:t>{</w:t>
+          </w:r>
+          <w:proofErr w:type="spellStart"/>
+          <w:r>
+            <w:rPr>
+              <w:rFonts w:ascii="Arial" w:hAnsi="Arial" w:cs="Arial"/>
+            </w:rPr>
+            <w:t>spectialInstructions</w:t>
+          </w:r>
+          <w:proofErr w:type="spellEnd"/>
+          <w:r>
+            <w:rPr>
+              <w:rFonts w:ascii="Arial" w:hAnsi="Arial" w:cs="Arial"/>
+            </w:rPr>
+            <w:t>}</w:t>
           </w:r>
         </w:p>
       </w:tc>
@@ -1678,12 +1938,14 @@
             </w:rPr>
             <w:t>{</w:t>
           </w:r>
+          <w:proofErr w:type="spellStart"/>
           <w:r>
             <w:rPr>
               <w:rFonts w:ascii="Arial" w:hAnsi="Arial" w:cs="Arial"/>
             </w:rPr>
             <w:t>inspectorEmail</w:t>
           </w:r>
+          <w:proofErr w:type="spellEnd"/>
           <w:r>
             <w:rPr>
               <w:rFonts w:ascii="Arial" w:hAnsi="Arial" w:cs="Arial"/>

</xml_diff>